<commit_message>
feat(portfolio): make search and filters a sticky top bar
Split the search and category filters out of the intro description block
Pin them to the top of the viewport with sticky top-0 while scrolling projects
Add bg-dark, bottom border, and shadow so the bar reads like a navbar
</commit_message>
<xml_diff>
--- a/public/Trey_Rader_Resume.docx
+++ b/public/Trey_Rader_Resume.docx
@@ -443,6 +443,24 @@
           <w:szCs w:val="18"/>
         </w:rPr>
         <w:t xml:space="preserve">Managed the end-to-end deployment of version 2.0 to the iOS App Store, including all required metadata updates, build configuration, and App Store review compliance.</w:t>
+      </w:r>
+    </w:p>
+    <w:p>
+      <w:pPr>
+        <w:numPr>
+          <w:ilvl w:val="0"/>
+          <w:numId w:val="2"/>
+        </w:numPr>
+        <w:spacing w:after="40" w:before="0"/>
+      </w:pPr>
+      <w:r>
+        <w:rPr>
+          <w:rFonts w:ascii="Calibri" w:cs="Calibri" w:eastAsia="Calibri" w:hAnsi="Calibri"/>
+          <w:color w:val="1F2937"/>
+          <w:sz w:val="18"/>
+          <w:szCs w:val="18"/>
+        </w:rPr>
+        <w:t xml:space="preserve">Designed and implemented a GitHub Actions CI/CD pipeline for fully automated deployment of the corporate marketing site to AWS EKS (Kubernetes), cutting deployment time from 15+ minutes of manual steps to under 6 minutes with zero local tooling required.</w:t>
       </w:r>
     </w:p>
     <w:p>

</xml_diff>